<commit_message>
Update project documentation and report generation
</commit_message>
<xml_diff>
--- a/AdaptSort核心调度算法设计逻辑与六类应用场景分析.docx
+++ b/AdaptSort核心调度算法设计逻辑与六类应用场景分析.docx
@@ -2,55 +2,132 @@
 <file path=word/document.xml><?xml version="1.0" encoding="utf-8"?>
 <w:document xmlns:wpc="http://schemas.microsoft.com/office/word/2010/wordprocessingCanvas" xmlns:mc="http://schemas.openxmlformats.org/markup-compatibility/2006" xmlns:o="urn:schemas-microsoft-com:office:office" xmlns:r="http://schemas.openxmlformats.org/officeDocument/2006/relationships" xmlns:m="http://schemas.openxmlformats.org/officeDocument/2006/math" xmlns:v="urn:schemas-microsoft-com:vml" xmlns:wp14="http://schemas.microsoft.com/office/word/2010/wordprocessingDrawing" xmlns:wp="http://schemas.openxmlformats.org/drawingml/2006/wordprocessingDrawing" xmlns:w10="urn:schemas-microsoft-com:office:word" xmlns:w="http://schemas.openxmlformats.org/wordprocessingml/2006/main" xmlns:w14="http://schemas.microsoft.com/office/word/2010/wordml" xmlns:w15="http://schemas.microsoft.com/office/word/2012/wordml" xmlns:wpg="http://schemas.microsoft.com/office/word/2010/wordprocessingGroup" xmlns:wpi="http://schemas.microsoft.com/office/word/2010/wordprocessingInk" xmlns:wne="http://schemas.microsoft.com/office/word/2006/wordml" xmlns:wps="http://schemas.microsoft.com/office/word/2010/wordprocessingShape" xmlns:cx="http://schemas.microsoft.com/office/drawing/2014/chartex" xmlns:cx1="http://schemas.microsoft.com/office/drawing/2015/9/8/chartex" xmlns:cx2="http://schemas.microsoft.com/office/drawing/2015/10/21/chartex" xmlns:cx3="http://schemas.microsoft.com/office/drawing/2016/5/9/chartex" xmlns:cx4="http://schemas.microsoft.com/office/drawing/2016/5/10/chartex" xmlns:cx5="http://schemas.microsoft.com/office/drawing/2016/5/11/chartex" xmlns:cx6="http://schemas.microsoft.com/office/drawing/2016/5/12/chartex" xmlns:cx7="http://schemas.microsoft.com/office/drawing/2016/5/13/chartex" xmlns:cx8="http://schemas.microsoft.com/office/drawing/2016/5/14/chartex" xmlns:aink="http://schemas.microsoft.com/office/drawing/2016/ink" xmlns:am3d="http://schemas.microsoft.com/office/drawing/2017/model3d" xmlns:w16cex="http://schemas.microsoft.com/office/word/2018/wordml/cex" xmlns:w16cid="http://schemas.microsoft.com/office/word/2016/wordml/cid" xmlns:w16="http://schemas.microsoft.com/office/word/2018/wordml" xmlns:w16sdtdh="http://schemas.microsoft.com/office/word/2020/wordml/sdtdatahash" xmlns:w16se="http://schemas.microsoft.com/office/word/2015/wordml/symex" mc:Ignorable="w14 w15 wp14">
   <w:body>
-    <w:p>
-      <w:pPr>
-        <w:spacing w:before="180" w:after="100" w:line="720"/>
-        <w:jc w:val="center"/>
-      </w:pPr>
-      <w:r>
-        <w:rPr>
-          <w:rFonts w:ascii="Times New Roman" w:eastAsia="SimHei"/>
-          <w:b/>
-          <w:bCs/>
-          <w:color w:val="0A1628"/>
-          <w:sz w:val="36"/>
-          <w:szCs w:val="36"/>
-        </w:rPr>
-        <w:t xml:space="preserve">AdaptSort核心调度算法设计逻辑与六类应用场景分析</w:t>
-      </w:r>
-    </w:p>
-    <w:p>
-      <w:pPr>
-        <w:spacing w:after="220" w:line="360"/>
-        <w:jc w:val="center"/>
-      </w:pPr>
-      <w:r>
-        <w:rPr>
-          <w:rFonts w:ascii="Times New Roman" w:eastAsia="SimSun"/>
-          <w:color w:val="5A6573"/>
-          <w:sz w:val="24"/>
-          <w:szCs w:val="24"/>
-        </w:rPr>
-        <w:t xml:space="preserve">算法设计与真实数据应用说明</w:t>
-      </w:r>
-    </w:p>
-    <w:p>
-      <w:pPr>
-        <w:pBdr>
-          <w:bottom w:val="single" w:color="3B6F92" w:sz="8" w:space="10"/>
-        </w:pBdr>
-        <w:spacing w:after="240" w:line="280"/>
-        <w:jc w:val="center"/>
-      </w:pPr>
-      <w:r>
-        <w:rPr>
-          <w:rFonts w:ascii="Times New Roman" w:eastAsia="SimSun"/>
-          <w:color w:val="5A6573"/>
-          <w:sz w:val="20"/>
-          <w:szCs w:val="20"/>
-        </w:rPr>
-        <w:t xml:space="preserve">项目依据：Algorithm-project-main 当前源代码、README 与场景设计资料</w:t>
-      </w:r>
+    <w:tbl>
+      <w:tblPr>
+        <w:tblW w:type="pct" w:w="100%"/>
+        <w:tblBorders>
+          <w:top w:val="none" w:color="FFFFFF" w:sz="0"/>
+          <w:left w:val="none" w:color="FFFFFF" w:sz="0"/>
+          <w:bottom w:val="none" w:color="FFFFFF" w:sz="0"/>
+          <w:right w:val="none" w:color="FFFFFF" w:sz="0"/>
+          <w:insideH w:val="none" w:color="FFFFFF" w:sz="0"/>
+          <w:insideV w:val="none" w:color="FFFFFF" w:sz="0"/>
+        </w:tblBorders>
+        <w:tblLayout w:type="fixed"/>
+      </w:tblPr>
+      <w:tblGrid>
+        <w:gridCol w:w="100"/>
+      </w:tblGrid>
+      <w:tr>
+        <w:trPr>
+          <w:cantSplit/>
+          <w:trHeight w:val="16838" w:hRule="exact"/>
+        </w:trPr>
+        <w:tc>
+          <w:tcPr>
+            <w:tcBorders>
+              <w:top w:val="none" w:color="FFFFFF" w:sz="0"/>
+              <w:left w:val="none" w:color="FFFFFF" w:sz="0"/>
+              <w:bottom w:val="none" w:color="FFFFFF" w:sz="0"/>
+              <w:right w:val="none" w:color="FFFFFF" w:sz="0"/>
+            </w:tcBorders>
+            <w:shd w:fill="FFFFFF" w:val="clear"/>
+            <w:vAlign w:val="top"/>
+          </w:tcPr>
+          <w:p>
+            <w:pPr>
+              <w:spacing w:before="4200" w:after="220" w:line="920"/>
+              <w:jc w:val="center"/>
+            </w:pPr>
+            <w:r>
+              <w:rPr>
+                <w:rFonts w:ascii="Times New Roman" w:eastAsia="SimHei"/>
+                <w:b/>
+                <w:bCs/>
+                <w:color w:val="0A1628"/>
+                <w:sz w:val="40"/>
+                <w:szCs w:val="40"/>
+              </w:rPr>
+              <w:t xml:space="preserve">AdaptSort</w:t>
+            </w:r>
+          </w:p>
+          <w:p>
+            <w:pPr>
+              <w:spacing w:after="180" w:line="720"/>
+              <w:jc w:val="center"/>
+            </w:pPr>
+            <w:r>
+              <w:rPr>
+                <w:rFonts w:ascii="Times New Roman" w:eastAsia="SimHei"/>
+                <w:b/>
+                <w:bCs/>
+                <w:color w:val="0A1628"/>
+                <w:sz w:val="36"/>
+                <w:szCs w:val="36"/>
+              </w:rPr>
+              <w:t xml:space="preserve">核心调度算法设计逻辑与六类应用场景分析</w:t>
+            </w:r>
+          </w:p>
+          <w:p>
+            <w:pPr>
+              <w:spacing w:after="1200" w:line="360"/>
+              <w:jc w:val="center"/>
+            </w:pPr>
+            <w:r>
+              <w:rPr>
+                <w:rFonts w:ascii="Times New Roman" w:eastAsia="SimSun"/>
+                <w:color w:val="5A6573"/>
+                <w:sz w:val="24"/>
+                <w:szCs w:val="24"/>
+              </w:rPr>
+              <w:t xml:space="preserve">算法设计与真实数据应用说明</w:t>
+            </w:r>
+          </w:p>
+          <w:p>
+            <w:pPr>
+              <w:pBdr>
+                <w:top w:val="single" w:color="3B6F92" w:sz="8" w:space="10"/>
+              </w:pBdr>
+              <w:spacing w:after="260" w:line="300"/>
+              <w:jc w:val="center"/>
+            </w:pPr>
+            <w:r>
+              <w:rPr>
+                <w:rFonts w:ascii="Times New Roman" w:eastAsia="SimSun"/>
+                <w:color w:val="5A6573"/>
+                <w:sz w:val="20"/>
+                <w:szCs w:val="20"/>
+              </w:rPr>
+              <w:t xml:space="preserve">项目依据：Algorithm-project-main 当前源代码、README 与场景设计资料</w:t>
+            </w:r>
+          </w:p>
+          <w:p>
+            <w:pPr>
+              <w:spacing w:after="0" w:line="300"/>
+              <w:jc w:val="center"/>
+            </w:pPr>
+            <w:r>
+              <w:rPr>
+                <w:rFonts w:ascii="Times New Roman" w:eastAsia="SimSun"/>
+                <w:color w:val="5A6573"/>
+                <w:sz w:val="20"/>
+                <w:szCs w:val="20"/>
+              </w:rPr>
+              <w:t xml:space="preserve">【作者】    【日期】</w:t>
+            </w:r>
+          </w:p>
+        </w:tc>
+      </w:tr>
+    </w:tbl>
+    <w:p>
+      <w:pPr>
+        <w:sectPr>
+          <w:pgSz w:w="11906" w:h="16838" w:orient="portrait"/>
+          <w:pgMar w:top="0" w:right="0" w:bottom="0" w:left="0" w:header="708" w:footer="708" w:gutter="0"/>
+          <w:pgNumType/>
+          <w:docGrid w:linePitch="360"/>
+        </w:sectPr>
+      </w:pPr>
     </w:p>
     <w:p>
       <w:pPr>
@@ -375,7 +452,7 @@
     <w:p>
       <w:pPr>
         <w:keepNext/>
-        <w:spacing w:before="80" w:after="80" w:line="280"/>
+        <w:spacing w:before="80" w:after="80" w:line="312"/>
         <w:jc w:val="center"/>
       </w:pPr>
       <w:r>
@@ -429,7 +506,7 @@
           </w:tcPr>
           <w:p>
             <w:pPr>
-              <w:spacing w:before="0" w:after="0" w:line="280"/>
+              <w:spacing w:before="0" w:after="0" w:line="312"/>
               <w:jc w:val="left"/>
             </w:pPr>
             <w:r>
@@ -464,7 +541,7 @@
           </w:tcPr>
           <w:p>
             <w:pPr>
-              <w:spacing w:before="0" w:after="0" w:line="280"/>
+              <w:spacing w:before="0" w:after="0" w:line="312"/>
               <w:jc w:val="left"/>
             </w:pPr>
             <w:r>
@@ -499,7 +576,7 @@
           </w:tcPr>
           <w:p>
             <w:pPr>
-              <w:spacing w:before="0" w:after="0" w:line="280"/>
+              <w:spacing w:before="0" w:after="0" w:line="312"/>
               <w:jc w:val="left"/>
             </w:pPr>
             <w:r>
@@ -538,7 +615,7 @@
           </w:tcPr>
           <w:p>
             <w:pPr>
-              <w:spacing w:before="0" w:after="0" w:line="280"/>
+              <w:spacing w:before="0" w:after="0" w:line="312"/>
               <w:jc w:val="left"/>
             </w:pPr>
             <w:r>
@@ -573,7 +650,7 @@
           </w:tcPr>
           <w:p>
             <w:pPr>
-              <w:spacing w:before="0" w:after="0" w:line="280"/>
+              <w:spacing w:before="0" w:after="0" w:line="312"/>
               <w:jc w:val="left"/>
             </w:pPr>
             <w:r>
@@ -607,7 +684,7 @@
           </w:tcPr>
           <w:p>
             <w:pPr>
-              <w:spacing w:before="0" w:after="0" w:line="280"/>
+              <w:spacing w:before="0" w:after="0" w:line="312"/>
               <w:jc w:val="left"/>
             </w:pPr>
             <w:r>
@@ -646,7 +723,7 @@
           </w:tcPr>
           <w:p>
             <w:pPr>
-              <w:spacing w:before="0" w:after="0" w:line="280"/>
+              <w:spacing w:before="0" w:after="0" w:line="312"/>
               <w:jc w:val="left"/>
             </w:pPr>
             <w:r>
@@ -681,7 +758,7 @@
           </w:tcPr>
           <w:p>
             <w:pPr>
-              <w:spacing w:before="0" w:after="0" w:line="280"/>
+              <w:spacing w:before="0" w:after="0" w:line="312"/>
               <w:jc w:val="left"/>
             </w:pPr>
             <w:r>
@@ -715,7 +792,7 @@
           </w:tcPr>
           <w:p>
             <w:pPr>
-              <w:spacing w:before="0" w:after="0" w:line="280"/>
+              <w:spacing w:before="0" w:after="0" w:line="312"/>
               <w:jc w:val="left"/>
             </w:pPr>
             <w:r>
@@ -754,7 +831,7 @@
           </w:tcPr>
           <w:p>
             <w:pPr>
-              <w:spacing w:before="0" w:after="0" w:line="280"/>
+              <w:spacing w:before="0" w:after="0" w:line="312"/>
               <w:jc w:val="left"/>
             </w:pPr>
             <w:r>
@@ -789,7 +866,7 @@
           </w:tcPr>
           <w:p>
             <w:pPr>
-              <w:spacing w:before="0" w:after="0" w:line="280"/>
+              <w:spacing w:before="0" w:after="0" w:line="312"/>
               <w:jc w:val="left"/>
             </w:pPr>
             <w:r>
@@ -823,7 +900,7 @@
           </w:tcPr>
           <w:p>
             <w:pPr>
-              <w:spacing w:before="0" w:after="0" w:line="280"/>
+              <w:spacing w:before="0" w:after="0" w:line="312"/>
               <w:jc w:val="left"/>
             </w:pPr>
             <w:r>
@@ -862,7 +939,7 @@
           </w:tcPr>
           <w:p>
             <w:pPr>
-              <w:spacing w:before="0" w:after="0" w:line="280"/>
+              <w:spacing w:before="0" w:after="0" w:line="312"/>
               <w:jc w:val="left"/>
             </w:pPr>
             <w:r>
@@ -896,7 +973,7 @@
           </w:tcPr>
           <w:p>
             <w:pPr>
-              <w:spacing w:before="0" w:after="0" w:line="280"/>
+              <w:spacing w:before="0" w:after="0" w:line="312"/>
               <w:jc w:val="left"/>
             </w:pPr>
             <w:r>
@@ -930,7 +1007,7 @@
           </w:tcPr>
           <w:p>
             <w:pPr>
-              <w:spacing w:before="0" w:after="0" w:line="280"/>
+              <w:spacing w:before="0" w:after="0" w:line="312"/>
               <w:jc w:val="left"/>
             </w:pPr>
             <w:r>
@@ -969,7 +1046,7 @@
           </w:tcPr>
           <w:p>
             <w:pPr>
-              <w:spacing w:before="0" w:after="0" w:line="280"/>
+              <w:spacing w:before="0" w:after="0" w:line="312"/>
               <w:jc w:val="left"/>
             </w:pPr>
             <w:r>
@@ -1004,7 +1081,7 @@
           </w:tcPr>
           <w:p>
             <w:pPr>
-              <w:spacing w:before="0" w:after="0" w:line="280"/>
+              <w:spacing w:before="0" w:after="0" w:line="312"/>
               <w:jc w:val="left"/>
             </w:pPr>
             <w:r>
@@ -1038,7 +1115,7 @@
           </w:tcPr>
           <w:p>
             <w:pPr>
-              <w:spacing w:before="0" w:after="0" w:line="280"/>
+              <w:spacing w:before="0" w:after="0" w:line="312"/>
               <w:jc w:val="left"/>
             </w:pPr>
             <w:r>
@@ -1077,7 +1154,7 @@
           </w:tcPr>
           <w:p>
             <w:pPr>
-              <w:spacing w:before="0" w:after="0" w:line="280"/>
+              <w:spacing w:before="0" w:after="0" w:line="312"/>
               <w:jc w:val="left"/>
             </w:pPr>
             <w:r>
@@ -1112,7 +1189,7 @@
           </w:tcPr>
           <w:p>
             <w:pPr>
-              <w:spacing w:before="0" w:after="0" w:line="280"/>
+              <w:spacing w:before="0" w:after="0" w:line="312"/>
               <w:jc w:val="left"/>
             </w:pPr>
             <w:r>
@@ -1146,7 +1223,7 @@
           </w:tcPr>
           <w:p>
             <w:pPr>
-              <w:spacing w:before="0" w:after="0" w:line="280"/>
+              <w:spacing w:before="0" w:after="0" w:line="312"/>
               <w:jc w:val="left"/>
             </w:pPr>
             <w:r>
@@ -1284,9 +1361,10 @@
     </w:p>
     <w:sectPr>
       <w:footerReference w:type="default" r:id="rId6"/>
+      <w:type w:val="nextPage"/>
       <w:pgSz w:w="11906" w:h="16838" w:orient="portrait"/>
       <w:pgMar w:top="1440" w:right="1417" w:bottom="1440" w:left="1701" w:header="708" w:footer="708" w:gutter="0"/>
-      <w:pgNumType/>
+      <w:pgNumType w:start="1" w:fmt="decimal"/>
       <w:docGrid w:linePitch="360"/>
     </w:sectPr>
   </w:body>

</xml_diff>